<commit_message>
v85 JIK: language and consistency fixes from an independent review
An independent review of the English against the Korean found no
number or citation mismatches and suggested 51 wording and consistency
fixes; the applicable ones are applied in both languages: abstract hedging
and tense (abstract kept at 250 words), associational wording for the
logit results, "applications" instead of "patents" for sample units,
5,277 defined as application-subgroup pairs within H01L21 and H01L24,
24/83 as the fifth H01L24 symbol, the all-CPC network named as such, the
largest-type claim in the conclusion limited to the baseline definition,
and the Appendix C scope stated.

Co-Authored-By: Claude Opus 5.5 <noreply@anthropic.com>
Claude-Session: https://claude.ai/code/session_01SvckvZxt3hAXTDPnm8YPEC
</commit_message>
<xml_diff>
--- a/journal/manuscript_v85_en_JIK.docx
+++ b/journal/manuscript_v85_en_JIK.docx
@@ -38,7 +38,7 @@
         <w:pStyle w:val="FirstParagraph"/>
       </w:pPr>
       <w:r>
-        <w:t xml:space="preserve">Front-end device fabrication and back-end assembly have long been separate knowledge domains of semiconductor manufacturing. Hybrid bonding, a back-end technology, achieves its required performance only with front-end fabrication knowledge, driving convergence, or knowledge integration, across process stages. Using hybrid bonding patent applications from the European Patent Office’s PATSTAT database, this study examines the level and forms of cross-stage knowledge integration, its change over time, and shifts in its locus. Applications were classified by their Cooperative Patent Classification co-classification, a trace of this integration, as bonding-only, process-only, or integrated and analyzed using multinomial and binary logit models and technology cluster and network analyses. First, integrated applications formed the largest group and remained substantial under a narrower definition excluding packaging-stage processes, so cross-stage convergence is not exceptional; integrated applications also spanned more diverse technologies. Second, integration evolved through three phases (formation, when process-only applications dominated; diffusion, when integrated applications peaked; and reconfiguration, when they declined and bonding-only applications increased) while the center of gravity of filings moved from fabrication processes toward bonding. Third, bonding applications containing the core technologies were far more likely than others to carry fabrication-process classifications in the formation phase, but this gap narrowed and became nonsignificant in the reconfiguration phase, and the center of fabrication processes combined with bonding shifted from wafer fabrication to processing apparatus and packaging-stage processes. Cross-stage convergence thus appears to be not a linear expansion but a dynamic process in which, as the core design becomes entrenched, knowledge integration relocates rather than disappears.</w:t>
+        <w:t xml:space="preserve">Front-end fabrication and back-end assembly have long been separate knowledge domains in semiconductor manufacturing. Hybrid bonding, a back-end technology, requires front-end fabrication knowledge to achieve its performance, driving convergence, or knowledge integration, across process stages. Using hybrid bonding patent applications from the European Patent Office’s PATSTAT, this study examines the level and forms of cross-stage knowledge integration, its change over time, and shifts in its locus. Applications were classified as bonding-only, process-only, or integrated by their Cooperative Patent Classification co-classification, a trace of this integration, and analyzed with multinomial and binary logit models and technology cluster and network analyses. First, integrated applications formed the largest group and remained substantial under a narrower definition excluding packaging-stage processes, indicating that cross-stage convergence was not exceptional; they also spanned more diverse technologies. Second, integration evolved through three phases (formation, when process-only applications dominated; diffusion, when integrated applications peaked; and reconfiguration, when they declined and bonding-only applications increased) as the weight of filings shifted from fabrication processes toward bonding. Third, bonding applications containing the core technologies were far more likely than others to carry fabrication-process classifications in the formation phase, but this gap became nonsignificant by the reconfiguration phase, and the center of the fabrication processes combined with bonding shifted from wafer fabrication to processing apparatus and packaging-stage processes. Cross-stage convergence is thus not a linear expansion but a dynamic process whose content and center are reorganized across phases; as the core design became entrenched, knowledge integration appears to have relocated rather than disappeared.</w:t>
       </w:r>
     </w:p>
     <w:p>
@@ -99,7 +99,7 @@
         <w:pStyle w:val="FirstParagraph"/>
       </w:pPr>
       <w:r>
-        <w:t xml:space="preserve">For more than half a century, the semiconductor industry has maintained a division of labor between the front end, which forms transistors on the wafer, and the back end, which dices finished wafers and assembles and packages the resulting dies. Front-end fabrication became concentrated in the large fabs of integrated device manufacturers and foundries, whereas packaging and testing were contracted out to outsourced semiconductor assembly and test providers (Brown &amp; Linden, 2009; Kapoor, 2013; Macher &amp; Mowery, 2004). This division of labor was possible because the interface between the two stages was stable. Stable interfaces allow production stages to specialize while maintaining distinct knowledge domains (Brusoni et al., 2001; Henderson &amp; Clark, 1990), but when technological change destabilizes such an interface, innovation increasingly requires integrating specialized knowledge from both sides of the boundary (Grant, 1996).</w:t>
+        <w:t xml:space="preserve">For more than half a century, the semiconductor industry has maintained a division of labor between the front end, which forms transistors on the wafer, and the back end, which dices finished wafers and assembles and packages the resulting dies. Front-end fabrication became concentrated in the large fabs of integrated device manufacturers and foundries, whereas packaging and testing were contracted out to specialized assembly and test firms (outsourced semiconductor assembly and test, OSAT) (Brown &amp; Linden, 2009; Kapoor, 2013; Macher &amp; Mowery, 2004). This division of labor was possible because the interface between the two stages was stable. Stable interfaces allow production stages to specialize while maintaining distinct knowledge domains (Brusoni et al., 2001; Henderson &amp; Clark, 1990), but when technological change destabilizes such an interface, innovation increasingly requires integrating specialized knowledge from both sides of the boundary (Grant, 1996).</w:t>
       </w:r>
     </w:p>
     <w:p>
@@ -107,7 +107,7 @@
         <w:pStyle w:val="BodyText"/>
       </w:pPr>
       <w:r>
-        <w:t xml:space="preserve">Advanced packaging has brought precisely this kind of change. As scaling ran into a slowdown in density gains and a steep rise in costs, the semiconductor industry began to seek new opportunities for performance gains in how dies are partitioned, stacked, and connected (Arden et al., 2010; Khan et al., 2018). Hybrid bonding, the technology at the center of this shift, directly bonds copper pads and the surrounding oxide without solder bumps and achieves interconnect pitches below 10 µm (Lau, 2021, 2022). The nanometer-scale surface planarization, surface activation, and precise alignment that determine its success are not capabilities that the back end has traditionally accumulated but front-end fabrication capabilities, and moves by leading foundries to internalize advanced packaging capabilities are also related to this deepening interdependence (KnowMade, 2024; Lau, 2022).</w:t>
+        <w:t xml:space="preserve">Advanced packaging has brought precisely this kind of change. As scaling ran into a slowdown in density gains and a steep rise in costs, the semiconductor industry began to seek new opportunities for performance gains in how dies are partitioned, stacked, and connected (Arden et al., 2010; Khan et al., 2018). Hybrid bonding, the technology at the center of this shift, directly bonds copper pads and the surrounding oxide without solder bumps and achieves interconnect pitches below 10 µm (Lau, 2021, 2022). The nanometer-scale surface planarization, surface activation, and precise alignment that determine its success are front-end fabrication capabilities rather than capabilities that the back end has traditionally accumulated. Moves by leading foundries to internalize advanced packaging capabilities are also related to this deepening interdependence (KnowMade, 2024; Lau, 2022).</w:t>
       </w:r>
     </w:p>
     <w:p>
@@ -171,7 +171,7 @@
         <w:pStyle w:val="BodyText"/>
       </w:pPr>
       <w:r>
-        <w:t xml:space="preserve">The study makes three contributions. First, it extends the scope of technology convergence research to convergence between manufacturing process stages within the same industry and extends the study of knowledge boundaries, which has centered on firm boundaries, to vertically separated process domains. Second, it analyzes convergence as a dynamic process in which the composition of types changes through phases of formation, diffusion, and reconfiguration, and it shows that cross-stage knowledge integration is reorganized nonlinearly. Third, by tracing how the relationship between core bonding technologies and fabrication-process technologies varies over time, it provides empirical grounds for the argument that, as the core design becomes entrenched, knowledge integration does not disappear but relocates from the core bonding interface to the peripheral processes that implement it.</w:t>
+        <w:t xml:space="preserve">The study makes three contributions. First, it broadens the scope of technology convergence research to convergence between manufacturing process stages within the same industry and extends the study of knowledge boundaries, which has centered on firm boundaries, to vertically separated process domains. Second, it analyzes convergence as a dynamic process in which the composition of types changes through phases of formation, diffusion, and reconfiguration, and it shows that cross-stage knowledge integration is reorganized nonlinearly. Third, by tracing how the relationship between core bonding technologies and fabrication-process technologies varies over time, it provides empirical grounds for the argument that, as the core design becomes entrenched, knowledge integration does not disappear but relocates from the core bonding interface to the peripheral processes that implement it.</w:t>
       </w:r>
     </w:p>
     <w:bookmarkEnd w:id="10"/>
@@ -198,7 +198,19 @@
         <w:pStyle w:val="FirstParagraph"/>
       </w:pPr>
       <w:r>
-        <w:t xml:space="preserve">Analyzing the emergence of the nineteenth-century machine tool industry, Rosenberg (1963) used the term technological convergence for the process by which machining techniques developed for firearms or sewing machines came to be applied to other products. In his account, the unit of convergence was not the final product but common production processes, and the machine tool industry, which accumulated this process knowledge, emerged as an independent specialized industry. Kodama (1992) conceptualized technology fusion as the process of combining previously separate technological fields to create capabilities that none of them possessed alone. From a knowledge-based perspective, such a combination amounts to the integration of previously separate bodies of specialized knowledge (Grant, 1996), and each invention can be seen as a new combination of existing knowledge components (Fleming, 2001).</w:t>
+        <w:t xml:space="preserve">Analyzing the emergence of the nineteenth-century machine tool industry, Rosenberg (1963) used the term</w:t>
+      </w:r>
+      <w:r>
+        <w:t xml:space="preserve"> </w:t>
+      </w:r>
+      <w:r>
+        <w:t xml:space="preserve">“technological convergence”</w:t>
+      </w:r>
+      <w:r>
+        <w:t xml:space="preserve"> </w:t>
+      </w:r>
+      <w:r>
+        <w:t xml:space="preserve">for the process by which machining techniques developed for firearms or sewing machines came to be applied to other products. In his account, the unit of convergence was not the final product but common production processes, and the machine tool industry, which accumulated this process knowledge, emerged as an independent specialized industry. Kodama (1992) conceptualized technology fusion as the process of combining previously separate technological fields to create capabilities that none of them possessed alone. From a knowledge-based perspective, such a combination amounts to the integration of previously separate bodies of specialized knowledge (Grant, 1996), and each invention can be seen as a new combination of existing knowledge components (Fleming, 2001).</w:t>
       </w:r>
     </w:p>
     <w:p>
@@ -206,7 +218,7 @@
         <w:pStyle w:val="BodyText"/>
       </w:pPr>
       <w:r>
-        <w:t xml:space="preserve">From case studies of 26 information and communication technology firms, Hacklin et al. (2010) derived a stage model in which convergence starts from knowledge convergence, when previously separate knowledge bases begin to overlap, and proceeds through technological convergence and applicational convergence to industrial convergence; they also argued that these stages form coevolutionary cycles through mutual feedback (Hacklin et al., 2009). Because convergence proceeds nonlinearly, not every convergence passes through all four stages in sequence, but the stage of technological convergence, in which technologies from different fields are combined within a single invention, is well suited to observation with patents (Curran et al., 2010; Curran &amp; Leker, 2011). Technology convergence research has since become established as a distinct research stream in technology and innovation management that also examines the drivers of convergence and the fields in which it is likely to occur (Caviggioli, 2016; Geum et al., 2016; Hwang, 2020; Sick &amp; Bröring, 2022; Whang, 2018).</w:t>
+        <w:t xml:space="preserve">From case studies of 26 information and communication technology firms, Hacklin et al. (2010) derived a stage model in which convergence starts from knowledge convergence, when previously separate knowledge bases begin to overlap, and proceeds through technological convergence and applicational convergence to industrial convergence, and Hacklin et al. (2009) argued that these stages form coevolutionary cycles through mutual feedback. Because convergence proceeds nonlinearly, not every instance of convergence passes through all four stages in sequence, but the stage of technological convergence, in which technologies from different fields are combined within a single invention, is well suited to observation with patents (Curran et al., 2010; Curran &amp; Leker, 2011). Technology convergence research has since become established as a distinct research stream in technology and innovation management that also examines the drivers of convergence and the fields in which it is likely to occur (Caviggioli, 2016; Geum et al., 2016; Hwang, 2020; Sick &amp; Bröring, 2022; Whang, 2018).</w:t>
       </w:r>
     </w:p>
     <w:p>
@@ -214,7 +226,7 @@
         <w:pStyle w:val="BodyText"/>
       </w:pPr>
       <w:r>
-        <w:t xml:space="preserve">This prior research, however, shares three features. First, its focus lies on overlaps between different industries or technological fields (Bröring et al., 2006; Gambardella &amp; Torrisi, 1998; No &amp; Park, 2010). Second, convergence is generally measured with field-level indicators that aggregate co-classifications or citations between two fields (Cho &amp; Kim, 2014; Choi et al., 2022; Curran et al., 2010; Song et al., 2017). Such indicators show whether and when two fields converge, but because differences among individual patents are hidden in the average, they can hardly explain which inventions embody convergence. Third, whereas theory views convergence as a staged process, empirical studies have largely been confined to confirming, as a trend, whether the degree of convergence has increased, and how the content and center of convergence change as convergence proceeds have received little attention. Sick and Bröring (2022) likewise noted that research treating convergence as a process has developed relatively independently of its theoretical foundations.</w:t>
+        <w:t xml:space="preserve">This prior research, however, shares three features. First, its focus lies on overlaps between different industries or technological fields (Bröring et al., 2006; Gambardella &amp; Torrisi, 1998; No &amp; Park, 2010). Second, convergence is generally measured with field-level indicators that aggregate co-classifications or citations between two fields (Cho &amp; Kim, 2014; Choi et al., 2022; Curran et al., 2010; Song et al., 2017). Such indicators show whether and when two fields converge, but because differences among individual patents are hidden in the average, they can hardly explain which inventions embody convergence. Third, whereas theory views convergence as a staged process, empirical studies have largely been confined to confirming, as a trend, whether the degree of convergence has increased; how the content and center of convergence change as convergence proceeds has received little attention. Sick and Bröring (2022) likewise noted that research treating convergence as a process has developed relatively independently of its theoretical foundations.</w:t>
       </w:r>
     </w:p>
     <w:bookmarkEnd w:id="11"/>
@@ -248,7 +260,7 @@
         <w:pStyle w:val="BodyText"/>
       </w:pPr>
       <w:r>
-        <w:t xml:space="preserve">Hybrid bonding is precisely a technology that makes the performance of one stage depend on the knowledge of another. Because its yield depends on front-end capabilities such as planarization, surface chemistry, and alignment, the interface between fabrication and packaging is no longer stable. This phenomenon was anticipated in research on the limits of scaling (Arden et al., 2010; Iyer, 2016; Khan et al., 2018) and has been documented technically in packaging engineering research (Lau, 2021, 2022), but few studies have observed it in the record of invention. In terms of the stage model, knowledge convergence in hybrid bonding corresponds to the stage at which fabrication-process knowledge such as planarization and surface activation begins to be applied to the problem of chip-to-chip connection; technological convergence, to the stage at which this knowledge is combined with bonded structures within a single invention; applicational convergence, to the stage at which the combined technology is implemented in products such as image sensors, 3D NAND, HBM, and chiplets; and industrial convergence, to the stage at which the division of labor itself is reorganized, as when leading foundries internalize advanced packaging (KnowMade, 2024; Lau, 2022). Of these, only technological convergence can be observed directly through patent co-classification. If the interface has become unstable, inventions incorporating knowledge from both stages should appear in a share that is not exceptional, and inventions spanning the two domains should combine more diverse technical elements than inventions confined to one domain.</w:t>
+        <w:t xml:space="preserve">Hybrid bonding is precisely a technology that makes the performance of one stage depend on the knowledge of another. Because its yield depends on front-end capabilities such as planarization, surface chemistry, and alignment, the interface between fabrication and packaging is no longer stable. This phenomenon was anticipated in research on the limits of scaling (Arden et al., 2010; Iyer, 2016; Khan et al., 2018) and has been documented technically in packaging engineering research (Lau, 2021, 2022), but few studies have observed it in the record of invention. In terms of the stage model, knowledge convergence in hybrid bonding corresponds to the stage at which fabrication-process knowledge such as planarization and surface activation begins to be applied to the problem of chip-to-chip connection; technological convergence, to the stage at which this knowledge is combined with bonded structures within a single invention; applicational convergence, to the stage at which the combined technology is implemented in products such as image sensors, 3D NAND, HBM, and chiplets; and industrial convergence, to the stage at which the division of labor itself is reorganized, as when leading foundries internalize advanced packaging (KnowMade, 2024; Lau, 2022). Of these, only technological convergence can be observed directly through patent co-classification. If the interface has become unstable, inventions incorporating knowledge from both stages should not be exceptional, and inventions spanning the two domains should combine more diverse technical elements than inventions confined to one domain.</w:t>
       </w:r>
     </w:p>
     <w:bookmarkEnd w:id="12"/>
@@ -266,7 +278,7 @@
         <w:pStyle w:val="FirstParagraph"/>
       </w:pPr>
       <w:r>
-        <w:t xml:space="preserve">According to the technology cycle model (Anderson &amp; Tushman, 1990), technological change follows a cycle of technological discontinuity, an era of ferment in which multiple designs compete, the emergence of a dominant design, and incremental change, and once a dominant design has been established, incremental innovation that refines the established design becomes central. Whereas the stage model shows the sequence of levels through which convergence passes, the technology cycle model shows the temporal process by which competing designs within a single technology converge, and Hacklin et al. (2009) also explained convergence on the basis of an innovation cycle model. Combining the two perspectives, process inventions that make direct bonding possible can be expected to predominate while the technology is forming (knowledge convergence), cases in which process knowledge is combined with bonding inventions should increase as the technology diffuses (technological convergence), and once a single design has become established as the dominant design, the combination of the two technologies should shift toward the peripheral processes required for applications (applicational convergence). Indeed, many early hybrid bonding inventions concerned processes such as surface preparation, low-temperature annealing, and planarization, but as the use of the technology expanded from wafer-level bonding to die-level bonding for HBM and logic, the focus of invention shifted to bonded structures and stacking (Lau, 2021). Patent-based studies of convergence dynamics have focused on how the degree of convergence between pairs of fields changes (Jeong et al., 2015; Yun &amp; Geum, 2019) and have paid relatively little attention to how the composition of convergence by form changes within a single technology.</w:t>
+        <w:t xml:space="preserve">According to the technology cycle model (Anderson &amp; Tushman, 1990), technological change follows a cycle of technological discontinuity, an era of ferment in which multiple designs compete, the emergence of a dominant design, and incremental change, and once a dominant design has been established, incremental innovation that refines the established design becomes central. Whereas the stage model shows the sequence of levels through which convergence passes, the technology cycle model shows the temporal process by which competing designs within a single technology converge, and Hacklin et al. (2009) also explained convergence on the basis of an innovation cycle model. When the two perspectives are combined, process inventions that make direct bonding possible can be expected to predominate while the technology is forming (knowledge convergence), cases in which process knowledge is combined with bonding inventions should increase as the technology diffuses (technological convergence), and once a single design has become established as the dominant design, the combination of the two technologies should shift toward the peripheral processes required for applications (applicational convergence). Indeed, many early hybrid bonding inventions concerned processes such as surface preparation, low-temperature annealing, and planarization, but as the use of the technology expanded from wafer-level bonding to die-level bonding for HBM and logic, the focus of invention shifted to bonded structures and stacking (Lau, 2021). Patent-based studies of convergence dynamics have focused on how the degree of convergence between pairs of fields changes (Jeong et al., 2015; Yun &amp; Geum, 2019) and have paid relatively little attention to how the composition of convergence by form changes within a single technology.</w:t>
       </w:r>
     </w:p>
     <w:p>
@@ -274,7 +286,7 @@
         <w:pStyle w:val="BodyText"/>
       </w:pPr>
       <w:r>
-        <w:t xml:space="preserve">Changes in convergence may also appear in the relationships among the elements that make up a technology. A complex technology consists of core elements that are closely linked to other elements and peripheral elements that are not, and Murmann and Frenken (2006) defined a dominant design as the stabilized design of the core elements that serve as stable interfaces with the other elements. Once the design of the core elements has stabilized, subsequent technological change can continue in the peripheral elements on the premise of those interfaces. The core element of hybrid bonding is a connection scheme in which bonding pads are bonded directly to one another without bumps or solder (Lau, 2021), and inventing it in an era of ferment, when the interfaces are not yet settled, requires dealing with fabrication-process knowledge such as surface planarization and wafer bonding. Once a dominant design has been established, however, the architectural knowledge that links components becomes embedded in an organization’s problem-solving routines and is taken for granted (Henderson &amp; Clark, 1990), and as interdependencies among components become predictable, the need to handle knowledge from the other side of the boundary decreases (Brusoni et al., 2001). Because hybrid bonding was first commercialized in wafer-level bonding and its use was later extended to die-level bonding (Lau, 2021, 2022), later filings are more likely to belong to a stage in which the design of the core technologies has become entrenched.</w:t>
+        <w:t xml:space="preserve">Changes in convergence may also appear in the relationships among the elements that make up a technology. A complex technology consists of core elements that are closely linked to other elements and peripheral elements that are not, and Murmann and Frenken (2006) defined a dominant design as the stabilized design of the core elements that serve as stable interfaces with the other elements. Once the design of the core elements has stabilized, subsequent technological change can continue in the peripheral elements, taking those interfaces as given. The core element of hybrid bonding is a connection scheme in which bonding pads are bonded directly to one another without bumps or solder (Lau, 2021), and inventing it in an era of ferment, when the interfaces are not yet settled, requires dealing with fabrication-process knowledge such as surface planarization and wafer bonding. Once a dominant design has been established, however, the architectural knowledge that links components becomes embedded in an organization’s problem-solving routines and is taken for granted (Henderson &amp; Clark, 1990), and as interdependencies among components become predictable, the need to handle knowledge from the other side of the boundary decreases (Brusoni et al., 2001). Because hybrid bonding was first commercialized in wafer-level bonding and its use was later extended to die-level bonding (Lau, 2021, 2022), later filings are more likely to belong to a stage in which the design of the core technologies has become entrenched.</w:t>
       </w:r>
     </w:p>
     <w:p>
@@ -282,7 +294,7 @@
         <w:pStyle w:val="BodyText"/>
       </w:pPr>
       <w:r>
-        <w:t xml:space="preserve">Inventions containing the core technologies can therefore be expected to incorporate fabrication-process knowledge more often than other bonding inventions while the technology is forming, but this difference should diminish over time, and new combinations should occur in peripheral processes that take the interface of the core technologies as given. In terms of the stage model, this is a movement from technological convergence to applicational convergence, that is, a relocation of the locus of knowledge integration from the core bonding interface to peripheral processes. Furthermore, just as the convergence of process knowledge in Rosenberg’s (1963) case spread through the equipment industry of machine tools, process equipment can serve as an intermediary that connects the two stages in cross-stage convergence. This is why this study divides fabrication processes into wafer fabrication, processing apparatus, and packaging-stage processes and compares the coupling of each domain with bonding technologies.</w:t>
+        <w:t xml:space="preserve">Inventions containing the core technologies can therefore be expected to incorporate fabrication-process knowledge more often than other bonding inventions while the technology is forming, but this difference should diminish over time, and new combinations should occur in peripheral processes that take the interface of the core technologies as given. In terms of the stage model, this is a movement from technological convergence to applicational convergence, that is, a relocation of the locus of knowledge integration from the core bonding interface to peripheral processes. Furthermore, just as the convergence of process knowledge in Rosenberg’s (1963) case spread through machine tools, an equipment industry, process equipment can serve as an intermediary that connects the two stages in cross-stage convergence. This is why this study divides fabrication processes into wafer fabrication, processing apparatus, and packaging-stage processes and compares the coupling of each domain with bonding technologies.</w:t>
       </w:r>
     </w:p>
     <w:bookmarkEnd w:id="13"/>
@@ -300,7 +312,7 @@
         <w:pStyle w:val="FirstParagraph"/>
       </w:pPr>
       <w:r>
-        <w:t xml:space="preserve">Patents are widely used to measure convergence because classification symbols place each invention in one or more technological fields (Curran &amp; Leker, 2011). Just as Fleming (2001) treated classification symbols as the technical components of an invention and their joint assignment as the recombination of components, the joint assignment of symbols from different domains to a single patent is a trace that knowledge from the two domains has been combined within an invention. In this sense, co-classification is an observable trace of invention-level knowledge integration, not a measure of knowledge transfer between organizations. Prior studies have generally aggregated co-classification into field-level indices (Cho &amp; Kim, 2014; Jeong et al., 2015; Kwon et al., 2020; Lee et al., 2015; Yun &amp; Geum, 2019), and others have used patent text to compensate for the limitation that classification reflects inventions only after the fact (Preschitschek et al., 2013; Zhu &amp; Motohashi, 2022).</w:t>
+        <w:t xml:space="preserve">Patents are widely used to measure convergence because classification symbols place each invention in one or more technological fields (Curran &amp; Leker, 2011). Just as Fleming (2001) treated classification symbols as the technical components of an invention and their joint assignment as the recombination of components, the joint assignment of symbols from different domains to a single patent is a trace of the combination of knowledge from the two domains within an invention. In this sense, co-classification is an observable trace of invention-level knowledge integration, not a measure of knowledge transfer between organizations. Prior studies have generally aggregated co-classification into field-level indices (Cho &amp; Kim, 2014; Jeong et al., 2015; Kwon et al., 2020; Lee et al., 2015; Yun &amp; Geum, 2019), and others have used patent text to compensate for the limitation that classification reflects inventions only after the fact (Preschitschek et al., 2013; Zhu &amp; Motohashi, 2022).</w:t>
       </w:r>
     </w:p>
     <w:p>
@@ -316,7 +328,7 @@
         <w:pStyle w:val="BodyText"/>
       </w:pPr>
       <w:r>
-        <w:t xml:space="preserve">The core technologies are identified with technology networks. If classification symbols are treated as nodes and pairs of jointly assigned symbols as links, the structure of combinations among technical elements can be represented as a network (Sternitzke et al., 2008), and the frequency with which two symbols are assigned together reflects the knowledge relatedness between the two technologies (Breschi et al., 2003). Treating the symbols most strongly linked to the others as core technologies approximates Murmann and Frenken’s (2006) concept of core elements in the combination structure of classifications, and period-to-period changes in the symbols that link different symbols indicate the locus of knowledge integration. Finally, technological scope applies Lerner’s (1994) approach of measuring patent scope by the number of classification symbols, restricted to the number of subgroups within the two classes (Hall &amp; Ziedonis, 2001; Ziedonis, 2004), and indicates how diverse the elements an invention combines across the two domains are. Because an integrated application by definition carries at least one symbol of each class, however, the relationship between technological scope and type has a mechanical aspect, which is addressed in Sections 4.3 and 5.4.</w:t>
+        <w:t xml:space="preserve">The core technologies are identified with technology cluster and network analyses (Section 4.4). If classification symbols are treated as nodes and pairs of jointly assigned symbols as links, the structure of combinations among technical elements can be represented as a network (Sternitzke et al., 2008), and the frequency with which two symbols are assigned together reflects the knowledge relatedness between the two technologies (Breschi et al., 2003). Treating the symbols most strongly linked to the others as core technologies approximates Murmann and Frenken’s (2006) concept of core elements in the combination structure of classifications, and period-to-period changes in the symbols that link different symbols indicate the locus of knowledge integration. Finally, technological scope applies Lerner’s (1994) approach of measuring patent scope by the number of classification symbols, restricted to the number of subgroups within the two classes (Hall &amp; Ziedonis, 2001; Ziedonis, 2004), and indicates the diversity of the elements that an invention combines across the two domains. Because an integrated application by definition carries at least one symbol of each class, however, the relationship between technological scope and type has a mechanical aspect, which is addressed in Sections 4.3 and 5.4.</w:t>
       </w:r>
     </w:p>
     <w:bookmarkEnd w:id="14"/>
@@ -544,7 +556,7 @@
                 <w:sz w:val="18"/>
                 <w:szCs w:val="18"/>
               </w:rPr>
-              <w:t xml:space="preserve">Between process stages whose interface has become unstable, inventions integrating knowledge from both domains appear in a share that is not exceptional, and such inventions include more diverse technical elements</w:t>
+              <w:t xml:space="preserve">Between process stages whose interface has become unstable, inventions integrating knowledge from both domains are not exceptional, and such inventions include more diverse technical elements</w:t>
             </w:r>
           </w:p>
         </w:tc>
@@ -706,7 +718,7 @@
                 <w:sz w:val="18"/>
                 <w:szCs w:val="18"/>
               </w:rPr>
-              <w:t xml:space="preserve">As the design of the core technologies becomes entrenched, the advantage of inventions containing them in incorporating fabrication-process knowledge diminishes, and the locus of knowledge integration shifts to the peripheral processes required for applications</w:t>
+              <w:t xml:space="preserve">As the design of the core technologies becomes entrenched, the advantage that inventions containing the core technologies have in incorporating fabrication-process knowledge diminishes, and the locus of knowledge integration shifts to the peripheral processes required for applications</w:t>
             </w:r>
           </w:p>
         </w:tc>
@@ -850,7 +862,7 @@
         <w:pStyle w:val="FirstParagraph"/>
       </w:pPr>
       <w:r>
-        <w:t xml:space="preserve">The steps that determine the yield of hybrid bonding are chemical mechanical polishing (CMP), which polishes surfaces to sub-nanometer roughness, plasma surface activation, particle control, and precise alignment, all of which belong to the semiconductor fabrication-process class (H01L21) of the CPC. The enabling processes in Figure 1 correspond mainly to H01L21, and the bonding configurations and interconnect structures mainly to the bonding and interconnect class (H01L24). In the actual D2W process flow as well, interlayer dielectric deposition, damascene etching, copper barrier and seed deposition, copper plating, and chemical mechanical polishing proceed in sequence before the dies are singulated and bonded, and all of these are processes and equipment used in the front end (Applied Materials, 2025). Hybrid bonding inventions must therefore combine front-end knowledge of planarization, surface chemistry, and alignment with back-end knowledge of die handling, stacking, and packaging, knowledge that has long been divided among different production stages and often among different firms.</w:t>
+        <w:t xml:space="preserve">The steps that determine the yield of hybrid bonding (chemical mechanical polishing (CMP), which polishes surfaces to sub-nanometer roughness; plasma surface activation; particle control; and precise alignment) all belong to the semiconductor fabrication-process class (H01L21) of the CPC. The enabling processes in Figure 1 correspond mainly to H01L21, and the bonding configurations and interconnect structures mainly to the bonding and interconnect class (H01L24). In the actual D2W process flow as well, interlayer dielectric deposition, damascene etching, copper barrier and seed deposition, copper plating, and chemical mechanical polishing proceed in sequence before the dies are singulated and bonded, and all of these are processes and equipment used in the front end (Applied Materials, 2025). Hybrid bonding inventions must therefore combine front-end knowledge of planarization, surface chemistry, and alignment with back-end knowledge of die handling, stacking, and packaging, knowledge that has long been divided among different production stages and often among different firms.</w:t>
       </w:r>
     </w:p>
     <w:p>
@@ -948,7 +960,7 @@
         <w:t xml:space="preserve">metal-oxide bond</w:t>
       </w:r>
       <w:r>
-        <w:t xml:space="preserve">) were then selected. The final sample consists of 928 applications filed between 1968 and 2024, or 5,277 application–CPC pairs. The sample is not the universe of hybrid bonding patents but the set of related applications identified by this search query, and it was designed broadly to capture not only contemporary hybrid bonding but also the early direct bonding precursor technologies on which it builds. Because symbols outside the two classes were not retained at the extraction stage, the regression data contain 262 subgroup symbols, 202 of the H01L21 class and 60 of the H01L24 class, whereas the technology cluster and network tables in Section 4.4 are based on a separate tabulation of all CPC symbols assigned to the same 928 applications (including the bonding indexing codes H01L2224 and the device assembly class H01L25). The unit of analysis is the individual patent application.</w:t>
+        <w:t xml:space="preserve">) were then selected. The final sample consists of 928 applications filed between 1968 and 2024, or 5,277 application–subgroup pairs within H01L21 and H01L24. The sample is not the universe of hybrid bonding patents but the set of related applications identified by this search query, and it was designed broadly to capture not only contemporary hybrid bonding but also the early direct bonding precursor technologies on which it builds. Because symbols outside the two classes were not retained at the extraction stage, the regression data contain 262 subgroup symbols, 202 of the H01L21 class and 60 of the H01L24 class, whereas the technology cluster and network tables in Section 4.4 are based on a separate tabulation of all CPC symbols assigned to the same 928 applications (including the bonding indexing codes H01L2224 and the device assembly class H01L25). The unit of analysis is the individual patent application.</w:t>
       </w:r>
     </w:p>
     <w:p>
@@ -1017,7 +1029,7 @@
         <w:t xml:space="preserve"> </w:t>
       </w:r>
       <w:r>
-        <w:t xml:space="preserve">sample). Second, 68 applications in which a search term is used in a different sense, as in direct bonded copper (DBC) substrates, in which copper is bonded to a ceramic substrate, or power modules (63 for</w:t>
+        <w:t xml:space="preserve">sample). Second, 68 applications in which a search term is used in a different sense (63 for</w:t>
       </w:r>
       <w:r>
         <w:t xml:space="preserve"> </w:t>
@@ -1046,7 +1058,7 @@
         <w:t xml:space="preserve">hybrid bonding</w:t>
       </w:r>
       <w:r>
-        <w:t xml:space="preserve">), were identified from their titles, and the models were re-estimated without them (Appendix A). Third, because the extracted records do not include patent family identifiers, the same invention filed at several offices is counted as several applications; this was checked with a sample that keeps only the earliest application among those sharing the same title and with standard errors clustered by title. The 928 applications comprise 473 unique titles, of which 149 were filed at two or more offices.</w:t>
+        <w:t xml:space="preserve">), such as direct bonded copper (DBC) substrates, where copper is bonded to a ceramic substrate, and power modules, were identified from their titles, and the models were re-estimated without them (Appendix A). Third, because the extracted records do not include patent family identifiers, the same invention filed at several offices is counted as several applications; this was checked with a sample that keeps only the earliest application among those sharing the same title and with standard errors clustered by title. The 928 applications comprise 473 unique titles, of which 149 were filed at two or more offices.</w:t>
       </w:r>
     </w:p>
     <w:bookmarkEnd w:id="23"/>
@@ -2004,7 +2016,7 @@
         <w:t xml:space="preserve"> </w:t>
       </w:r>
       <w:r>
-        <w:t xml:space="preserve">in CPC terminology; 529 applications, 57.0%), and 24/08, the structure of bonding pads after connection (513 applications, 55.3%), followed by 2224/80895, direct bonding between electrically conductive surfaces (504 applications), and 2224/80896, direct bonding between electrically insulating surfaces (488 applications). Read together, these symbols define hybrid bonding within the classification system as a technology that forms copper-based bonding pads (2224/05647) flush with the surface (2224/80357) and directly bonds the metal (2224/80895) and the dielectric (2224/80896) together (24/08, 24/80) to stack chips vertically without bumps (2224/08145, 25/0657). In the technology network as well, the strongest link is the pair formed by the direct bonding of conductive surfaces and the direct bonding of insulating surfaces (460 applications), and all of the ten strongest pairs are combinations of two of the five symbols 24/08, 24/80, 2224/80895, 2224/80896, and 2224/08145 (Appendix B). The core technologies of hybrid bonding are thus concentrated in a small number of closely linked bonding symbols.</w:t>
+        <w:t xml:space="preserve">in CPC terminology; 529 applications, 57.0%), and 24/08, the structure of bonding pads after connection (513 applications, 55.3%), followed by 2224/80895, direct bonding between electrically conductive surfaces (504 applications), and 2224/80896, direct bonding between electrically insulating surfaces (488 applications). Read together, these symbols define hybrid bonding within the classification system as a technology that forms copper-based bonding pads (2224/05647) flush with the surface (2224/80357) and directly bonds the metal (2224/80895) and the dielectric (2224/80896) together (24/08, 24/80) to stack chips vertically without bumps (2224/08145, 25/0657). In the network of all CPC symbols as well, the strongest link is the pair formed by the direct bonding of conductive surfaces and the direct bonding of insulating surfaces (460 applications), and all of the ten strongest pairs are combinations of two of the five symbols 24/08, 24/80, 2224/80895, 2224/80896, and 2224/08145 (Appendix B). The core technologies of hybrid bonding are thus concentrated in a small number of closely linked bonding symbols.</w:t>
       </w:r>
     </w:p>
     <w:p>
@@ -3650,7 +3662,7 @@
         <w:pStyle w:val="BodyText"/>
       </w:pPr>
       <w:r>
-        <w:t xml:space="preserve">Because indexing codes are not included in the regression data, the core technologies used in the analysis were selected from among the H01L24 symbols in the regression data. The four H01L24 symbols assigned to 200 or more applications in Table 3 (24/80, 24/08, 24/05, and 24/03) are also the four symbols with the greatest connection strength (the sum of the numbers of applications in which a symbol is assigned together with other symbols) in the network of the regression data (Figure 3; 3,235, 3,140, 2,518, and 1,778), and the six pairs formed by these four symbols (186–439 applications) are the six strongest links in the entire network. In the CPC scheme, all four symbols belong to the groups concerning bonding pads: 24/03 and 24/05 cover the manufacture of bonding pads and their structure before connection, and 24/08 and 24/80 cover the structure after bonding pads have been connected to one another without separate connectors such as bumps, layers, or wires, and the corresponding connection methods. This study therefore defines these four symbols as the core technologies of hybrid bonding. Connection using layer connectors (24/83), the fifth most frequent symbol by number of applications, is assigned to 164 applications and thus falls short of the 200-application threshold. Of the 763 applications carrying H01L24 symbols (hereafter bonding applications), 620 (81.3%) contain the core technologies.</w:t>
+        <w:t xml:space="preserve">Because indexing codes are not included in the regression data, the core technologies used in the analysis were selected from among the H01L24 symbols in the regression data. The four H01L24 symbols assigned to 200 or more applications in Table 3 (24/80, 24/08, 24/05, and 24/03) are also the four symbols with the greatest connection strength (the sum of the numbers of applications in which a symbol is assigned together with other symbols) in the network of the regression data (Figure 3; 3,235, 3,140, 2,518, and 1,778), and the six pairs formed by these four symbols (186–439 applications) are the six strongest links in the entire network. In the CPC scheme, all four symbols belong to the groups concerning bonding pads: 24/03 and 24/05 cover the manufacture of bonding pads and their structure before connection, and 24/08 and 24/80 cover the structure after bonding pads have been connected to one another without separate connectors such as bumps, layers, or wires, and the corresponding connection methods. This study therefore defines these four symbols as the core technologies of hybrid bonding. Connection using layer connectors (24/83), the fifth most frequent H01L24 symbol by number of applications, is assigned to 164 applications and thus falls short of the 200-application threshold. Of the 763 applications carrying H01L24 symbols (hereafter bonding applications), 620 (81.3%) contain the core technologies.</w:t>
       </w:r>
     </w:p>
     <w:p>
@@ -3744,7 +3756,7 @@
         <w:pStyle w:val="FirstParagraph"/>
       </w:pPr>
       <w:r>
-        <w:t xml:space="preserve">This study uses three models, all of which include filing office dummies as control variables. The main model, the co-classification type model, is a multinomial logit (McFadden, 1974) with tech_cat as the dependent variable (N = 928). A multinomial logit is used because the three categories represent different CPC configurations rather than an order of magnitude, and the results are reported as relative risk ratios (RRRs) of the integrated and process-only types, with bonding-only as the base category. The supplementary fabrication-process classification model is a binary logit with has_process as the dependent variable, and its results are reported as odds ratios (ORs). The explanatory variables of both models are technological scope and filing year. Because ORs and RRRs are not rates of change in probability, average predicted probabilities, obtained by varying only the explanatory variable of interest while holding the other variables at each application’s observed values, are also presented for the multinomial logit.</w:t>
+        <w:t xml:space="preserve">This study uses three models, all of which include filing office dummies as control variables. The main model, the co-classification type model, is a multinomial logit (McFadden, 1974) with tech_cat as the dependent variable (N = 928). A multinomial logit is used because the three categories represent different CPC configurations rather than ordered categories, and the results are reported as relative risk ratios (RRRs) of the integrated and process-only types, with bonding-only as the base category. The supplementary fabrication-process classification model is a binary logit with has_process as the dependent variable, and its results are reported as odds ratios (ORs). The explanatory variables of both models are technological scope and filing year. Because ORs and RRRs are not rates of change in probability, average predicted probabilities, obtained by varying only the explanatory variable of interest while holding the other variables at each application’s observed values, are also presented for the multinomial logit.</w:t>
       </w:r>
     </w:p>
     <w:p>
@@ -3855,7 +3867,7 @@
         <w:pStyle w:val="BodyText"/>
       </w:pPr>
       <w:r>
-        <w:t xml:space="preserve">Robustness is examined with the alternative samples and definitions of Sections 4.1 and 4.2 and with standard errors clustered by title; for the core technology model, a model that controls for the number of bonding symbols other than the core symbols and a definition that restricts the core technologies to the most strongly linked pair (24/08 and 24/80) are added. The independence of irrelevant alternatives (IIA) assumed by the multinomial logit is checked with an alternative-exclusion sensitivity analysis (Appendix C). The results are interpreted at the 5% significance level, but the consistency of the direction, magnitude, and significance of the coefficients across the baseline model and the alternative samples and definitions is assessed comprehensively, and all coefficients are interpreted not as causal effects but as conditional associations that control for the observed variables.</w:t>
+        <w:t xml:space="preserve">Robustness is examined with the alternative samples and definitions of Sections 4.1–4.3 and with standard errors clustered by title; for the core technology model, a model that controls for the number of bonding symbols other than the core symbols and a definition that restricts the core technologies to the most strongly linked pair of core symbols (24/08 and 24/80) are added. The independence of irrelevant alternatives (IIA) assumed by the multinomial logit is checked with an alternative-exclusion sensitivity analysis (Appendix C). The results are interpreted at the 5% significance level, but the consistency of the direction, magnitude, and significance of the coefficients across the baseline model and the alternative samples and definitions is considered jointly, and all coefficients are interpreted not as causal effects but as conditional associations that control for the observed variables.</w:t>
       </w:r>
     </w:p>
     <w:bookmarkEnd w:id="33"/>
@@ -3891,7 +3903,7 @@
         <w:pStyle w:val="BodyText"/>
       </w:pPr>
       <w:r>
-        <w:t xml:space="preserve">Table 4 presents the results of the binary logit of fabrication-process classification and the multinomial logit of the co-classification type. In the binary logit, technological scope showed a strong positive association with carrying fabrication-process symbols: each additional CPC subgroup increased the odds of carrying a fabrication-process symbol by about 27% (OR 1.267, p &lt; 0.01). The area under the receiver operating characteristic curve (AUC), an indicator of the model’s discriminatory power, is 0.707, at the lower end of the acceptable range according to the criteria of Hosmer et al. (2013). In the main analysis, the multinomial logit,</w:t>
+        <w:t xml:space="preserve">Table 4 presents the results of the binary logit of fabrication-process classification and the multinomial logit of the co-classification type. In the binary logit, technological scope showed a strong positive association with carrying fabrication-process symbols: each additional CPC subgroup was associated with about 27% higher odds of carrying a fabrication-process symbol (OR 1.267, p &lt; 0.01). The area under the receiver operating characteristic curve (AUC), an indicator of the model’s discriminatory power, is 0.707, at the lower end of the acceptable range according to the criteria of Hosmer et al. (2013). In the main analysis, the multinomial logit,</w:t>
       </w:r>
       <w:r>
         <w:t xml:space="preserve"> </w:t>
@@ -3907,7 +3919,7 @@
         <w:t xml:space="preserve"> </w:t>
       </w:r>
       <w:r>
-        <w:t xml:space="preserve">With each additional CPC subgroup, the relative risk of being integrated rather than bonding-only increased by 40% (RRR 1.403, p &lt; 0.01), and that of being process-only decreased by 10% (RRR 0.905, p &lt; 0.05). As the left panel of Figure 4 shows, the predicted probabilities for an application with a technological scope of 3 are 0.26 for integrated, 0.50 for bonding-only, and 0.24 for process-only, whereas those for an application with a technological scope of 8 are 0.68, 0.24, and 0.08, respectively. Applications with a broad scope tend to span the two domains, and those with a narrow scope tend to remain within one domain, which reflects a compositional characteristic: integrated patents include more diverse technical elements.</w:t>
+        <w:t xml:space="preserve">With each additional CPC subgroup, the relative risk of being integrated rather than bonding-only was 40% higher (RRR 1.403, p &lt; 0.01), and that of being process-only about 10% lower (RRR 0.905, p &lt; 0.05). As the left panel of Figure 4 shows, the predicted probabilities for an application with a technological scope of 3 are 0.26 for integrated, 0.50 for bonding-only, and 0.24 for process-only, whereas those for an application with a technological scope of 8 are 0.68, 0.24, and 0.08, respectively. Applications with a broad scope tend to span the two domains, and those with a narrow scope tend to remain within one domain, which reflects a compositional characteristic: integrated applications include more diverse technical elements.</w:t>
       </w:r>
     </w:p>
     <w:p>
@@ -4432,13 +4444,13 @@
           <w:b/>
           <w:bCs/>
         </w:rPr>
-        <w:t xml:space="preserve">The more recent the filing year, the more likely patents were to be classified as bonding-only rather than process-only.</w:t>
-      </w:r>
-      <w:r>
-        <w:t xml:space="preserve"> </w:t>
-      </w:r>
-      <w:r>
-        <w:t xml:space="preserve">In the multinomial logit of Table 4, the relative risk of the process-only type decreased by about 8.7% per year (RRR 0.913, p &lt; 0.01), whereas the relative risk of the integrated type showed no significant linear trend over the entire period (RRR 0.993). The predicted probability of being process-only was 0.27 for applications filed in 2010 but 0.12 for those filed in 2022; over the same period, that of being bonding-only increased from 0.31 to 0.40, whereas that of being integrated barely changed, from 0.43 to 0.47 (Figure 4, right). In the binary logit as well, more recent applications had lower odds of carrying fabrication-process symbols (annual OR 0.946, p &lt; 0.01), mainly because of the decline of the process-only type. In a multinomial logit that includes period dummies instead of a linear year term, the relative risk of the process-only type relative to 1968–2014 likewise fell to 0.273 in 2015–2019 and 0.101 in 2020–2024 (both p &lt; 0.01), whereas that of the integrated type rose to 1.707 (p = 0.09) and then fell to 0.762 (not significant). In the sample of applications filed in 2010 or later (N = 830), the year coefficient was significantly less than 1 for the integrated type as well (RRR 0.934, p &lt; 0.05), and the same held for the narrow fabrication-process definition and the sample excluding irrelevant uses (Appendix C). The center of gravity of filings thus shifted from fabrication processes toward bonding.</w:t>
+        <w:t xml:space="preserve">The more recent the filing year, the more likely applications were to be classified as bonding-only rather than process-only.</w:t>
+      </w:r>
+      <w:r>
+        <w:t xml:space="preserve"> </w:t>
+      </w:r>
+      <w:r>
+        <w:t xml:space="preserve">In the multinomial logit of Table 4, the relative risk of the process-only type decreased by about 8.7% per year (RRR 0.913, p &lt; 0.01), whereas the relative risk of the integrated type showed no significant linear trend over the entire period (RRR 0.993). The predicted probability of being process-only was 0.27 for applications filed in 2010 but 0.12 for those filed in 2022; over the same period, that of being bonding-only increased from 0.31 to 0.40, whereas that of being integrated barely changed, from 0.43 to 0.47 (Figure 4, right). In the binary logit as well, more recent applications had lower odds of carrying fabrication-process symbols (annual OR 0.946, p &lt; 0.01), mainly because of the decline of the process-only type. In a multinomial logit that includes period dummies instead of a linear year term, the RRR of the process-only type relative to 1968–2014 was likewise 0.273 in 2015–2019 and 0.101 in 2020–2024 (both p &lt; 0.01), whereas that of the integrated type was 1.707 (p = 0.09) and then 0.762 (not significant). In the sample of applications filed in 2010 or later (N = 830), the year coefficient was significantly less than 1 for the integrated type as well (RRR 0.934, p &lt; 0.05), and the same held for the narrow fabrication-process definition and the sample excluding irrelevant uses (Appendix C). The center of gravity of filings thus shifted from fabrication processes toward bonding.</w:t>
       </w:r>
     </w:p>
     <w:p>
@@ -4446,7 +4458,7 @@
         <w:pStyle w:val="BodyText"/>
       </w:pPr>
       <w:r>
-        <w:t xml:space="preserve">Meanwhile, the association between technological scope and the integrated type persisted in all three phases. When the model is estimated separately for each period, the RRR of technological scope for the integrated type was 1.179 in the formation phase, 1.513 in the diffusion phase, and 1.414 in the reconfiguration phase, all significant at the 1% level (for the first period, filing office dummies were excluded because many filing office cells were empty). Although the share of integration and the center of gravity of filings changed from phase to phase, the characteristic that boundary-spanning patents include more diverse technical elements persisted.</w:t>
+        <w:t xml:space="preserve">Meanwhile, the association between technological scope and the integrated type persisted in all three phases. When the model was estimated separately for each period, the RRR of technological scope for the integrated type was 1.179 in the formation phase, 1.513 in the diffusion phase, and 1.414 in the reconfiguration phase, all significant at the 1% level (for the first period, filing office dummies were excluded because many filing office cells were empty). Although the integrated share and the center of gravity of filings changed from phase to phase, the characteristic that boundary-spanning patents include more diverse technical elements persisted.</w:t>
       </w:r>
     </w:p>
     <w:bookmarkEnd w:id="42"/>
@@ -4464,7 +4476,7 @@
         <w:pStyle w:val="FirstParagraph"/>
       </w:pPr>
       <w:r>
-        <w:t xml:space="preserve">To determine where in the technological architecture knowledge from the two stages was integrated in each phase, the core technology model (Table 5) and the coupling indicators by fabrication-process domain (Table 6) were analyzed.</w:t>
+        <w:t xml:space="preserve">To determine where in the technological architecture knowledge from the two stages was integrated in each phase, this study analyzed the core technology model (Table 5) and the coupling indicators by fabrication-process domain (Table 6).</w:t>
       </w:r>
     </w:p>
     <w:p>
@@ -5084,7 +5096,7 @@
         <w:pStyle w:val="BodyText"/>
       </w:pPr>
       <w:r>
-        <w:t xml:space="preserve">This change originated in the applications containing the core technologies. The integrated share of bonding applications without the core technologies actually rose, whereas that of applications containing them fell. Over the same periods, the share of applications containing the core technologies among bonding applications rose from 53.5% to 78.7% and 88.0%, which suggests that invention converged on a single core design. The fabrication-process symbols assigned together with the core technologies also differed across periods. In integrated applications containing the core technologies, the most frequent H01L21 symbols were the joining of semiconductor bodies (21/187; 22 applications) and through-substrate vias (21/76898; 21 applications) in 2015–2019 but support using temporary substrates (21/6835; 48 applications) and temporary substrates used as encapsulation process aids (21/568; 43 applications) in 2020–2024. The latter two symbols concern processes for supporting dies and completing them as packages rather than the bonding principle itself.</w:t>
+        <w:t xml:space="preserve">This change originated in the applications containing the core technologies. The integrated share of bonding applications without the core technologies actually rose, whereas that of applications containing them fell. Over the same periods, the share of applications containing the core technologies among bonding applications rose from 53.5% to 78.7% and 88.0%, which suggests that invention converged on a single core design. The fabrication-process symbols assigned together with the core technologies also differed across periods. In integrated applications containing the core technologies, the most frequent H01L21 symbols in 2015–2019 were the joining of semiconductor bodies (21/187; 22 applications) and through-substrate vias (21/76898; 21 applications), whereas those in 2020–2024 were support using temporary substrates (21/6835; 48 applications) and temporary substrates used as encapsulation process aids (21/568; 43 applications). The latter two symbols concern processes for supporting dies and completing them as packages rather than the bonding principle itself.</w:t>
       </w:r>
     </w:p>
     <w:p>
@@ -5092,7 +5104,7 @@
         <w:pStyle w:val="BodyText"/>
       </w:pPr>
       <w:r>
-        <w:t xml:space="preserve">This shift is also evident in the fabrication-process domains as a whole and in the structure of the technology network (Table 6). The Jaccard coefficient of wafer fabrication with bonding symbols peaked at 0.598 in the diffusion phase and then dropped sharply to 0.159 in the reconfiguration phase, whereas those of processing apparatus and packaging-stage processes rose steadily. From the diffusion phase to the reconfiguration phase, the number of applications in which a domain’s symbols were assigned together with bonding symbols decreased from 119 to 82 for wafer fabrication but increased from 11 to 89 for processing apparatus and from 43 to 139 for packaging-stage processes, so the fabrication-process domain most strongly coupled with bonding changed from wafer fabrication to packaging-stage processes. In the technology network, the three symbols with the greatest connection strength were core symbols (24/80, 24/08, and 24/05) in all three periods, so the core technologies retained their position as hubs. By contrast, the share of total betweenness centrality accounted for by wafer fabrication symbols fell from 53.6% in the formation phase and 42.5% in the diffusion phase to 9.0% in the reconfiguration phase, when processing apparatus symbols accounted for 26.1%. In the reconfiguration phase, the five fabrication-process symbols with the highest betweenness centrality were four processing apparatus symbols (21/67121, apparatus for making assemblies; 21/67766, mechanical parts of transfer devices; 21/67092, apparatus for mechanical treatment; and 21/6835, support using temporary substrates) and one packaging-stage process symbol (21/50), and the direction was the same when betweenness centrality was recalculated with the reciprocals of the link weights as distances. While the core technologies remained the hub, the locus of knowledge integration moved from wafer fabrication to processing apparatus and packaging-stage processes.</w:t>
+        <w:t xml:space="preserve">This shift is also evident in the fabrication-process domains as a whole and in the structure of the technology network (Table 6). The Jaccard coefficient of wafer fabrication with bonding symbols peaked at 0.598 in the diffusion phase and then dropped sharply to 0.159 in the reconfiguration phase, whereas those of processing apparatus and packaging-stage processes rose steadily. From the diffusion phase to the reconfiguration phase, the number of applications in which a domain’s symbols were assigned together with bonding symbols decreased from 119 to 82 for wafer fabrication but increased from 11 to 89 for processing apparatus and from 43 to 139 for packaging-stage processes, so the fabrication-process domain most strongly coupled with bonding changed from wafer fabrication to packaging-stage processes. In the technology network, the three symbols with the greatest connection strength were core symbols (24/80, 24/08, and 24/05) in all three periods, so the core technologies retained their position as hubs. By contrast, the share of total betweenness centrality accounted for by wafer fabrication symbols fell from 53.6% in the formation phase and 42.5% in the diffusion phase to 9.0% in the reconfiguration phase, when processing apparatus symbols accounted for 26.1%. In the reconfiguration phase, the five fabrication-process symbols with the highest betweenness centrality were four processing apparatus symbols (21/67121, apparatus for making assemblies; 21/67766, mechanical parts of transfer devices; 21/67092, apparatus for mechanical treatment; and 21/6835, support using temporary substrates) and one packaging-stage process symbol (21/50), and the direction was the same when betweenness centrality was recalculated with the reciprocals of the link weights as distances. While the core technologies remained hubs, the locus of knowledge integration moved from wafer fabrication to processing apparatus and packaging-stage processes.</w:t>
       </w:r>
     </w:p>
     <w:p>
@@ -6736,7 +6748,7 @@
           <w:sz w:val="20"/>
           <w:szCs w:val="20"/>
         </w:rPr>
-        <w:t xml:space="preserve">In the clustered standard error row, the point estimates are identical to the baseline, and only the significance is based on clustering by title. The standard errors, the remaining coefficients, and the results for the type-minimum-adjusted CPC scope (breadth_adj) are presented in Appendix C.</w:t>
+        <w:t xml:space="preserve">In the clustered standard error row, the point estimates are identical to the baseline, and only the significance is based on clustering by title. The standard errors of the unclustered estimations, the remaining coefficients, and the results for the type-minimum-adjusted CPC scope (breadth_adj) are presented in Appendix C.</w:t>
       </w:r>
     </w:p>
     <w:p>
@@ -6776,7 +6788,7 @@
         <w:t xml:space="preserve"> </w:t>
       </w:r>
       <w:r>
-        <w:t xml:space="preserve">sample (N = 467), the integrated share was 49.5% and the RRR of technological scope for the integrated type (1.485) was significant, but the year coefficient was not (1.029) because the sample contains only 30 applications filed up to 2014. The decline of the process-only type largely reflects a transition from wafer bonding process applications of the period in which the term</w:t>
+        <w:t xml:space="preserve">sample (N = 467), the integrated share was 49.5% and the RRR of technological scope for the integrated type (1.485) was significant, but the year coefficient for the process-only type was not (1.029), as the sample contains only 30 applications filed up to 2014. This appears to be because the decline of the process-only type largely reflects a transition from wafer bonding process applications filed when the term</w:t>
       </w:r>
       <w:r>
         <w:t xml:space="preserve"> </w:t>
@@ -6792,7 +6804,7 @@
         <w:t xml:space="preserve"> </w:t>
       </w:r>
       <w:r>
-        <w:t xml:space="preserve">was mainly used to structural applications of the</w:t>
+        <w:t xml:space="preserve">prevailed to structural applications of the</w:t>
       </w:r>
       <w:r>
         <w:t xml:space="preserve"> </w:t>
@@ -6808,7 +6820,7 @@
         <w:t xml:space="preserve"> </w:t>
       </w:r>
       <w:r>
-        <w:t xml:space="preserve">period, and this sample cannot adequately observe the earlier period.</w:t>
+        <w:t xml:space="preserve">era, a transition that this sample cannot adequately observe.</w:t>
       </w:r>
     </w:p>
     <w:p>
@@ -7944,7 +7956,7 @@
         <w:pStyle w:val="BodyText"/>
       </w:pPr>
       <w:r>
-        <w:t xml:space="preserve">In the core technology model, the finding that the odds ratio for 1968–2014 exceeds 1, that the odds ratio for 2020–2024 does not differ significantly from 1, and that the difference between them (last column) is significantly less than 1 held in all seven estimations (Table 8). Controlling for the number of bonding symbols other than the core symbols (whose own odds ratio is 1.100, p &lt; 0.01) barely changed the period-specific odds ratios, so the effect of the core technologies does not simply reflect applications carrying many bonding symbols. In the sample excluding irrelevant uses, where the results are weakest, the odds ratio for 1968–2014 falls to 3.981, because 28 of the 51 irrelevant applications with bonding symbols were filed up to 2014 without the core technologies and 25 of these were bonding-only. Even in this sample, the odds ratio for 1968–2014 (p &lt; 0.05) and the 2020–2024 interaction (0.185, p &lt; 0.05) were significant. The odds ratio for 2015–2019, however, loses significance with clustered standard errors and in the sample excluding irrelevant uses, so whether the advantage of the core technologies became nonsignificant in the diffusion phase or in the reconfiguration phase is left undetermined. Overall, the key results for RQ1 and RQ3 held in all re-estimations, and the temporal trend for RQ2 held in all re-estimations except the</w:t>
+        <w:t xml:space="preserve">In the core technology model, the findings that the odds ratio for 1968–2014 exceeds 1, that the odds ratio for 2020–2024 does not differ significantly from 1, and that the ratio between them (last column) is significantly less than 1 held in all seven estimations (Table 8). Controlling for the number of bonding symbols other than the core symbols (whose own odds ratio is 1.100, p &lt; 0.01) barely changed the period-specific odds ratios, so the association of the core technologies does not simply reflect applications carrying many bonding symbols. In the sample excluding irrelevant uses, where the results are weakest, the odds ratio for 1968–2014 falls to 3.981, because 28 of the 51 irrelevant applications with bonding symbols were filed up to 2014 without the core technologies and 25 of these were bonding-only. Even in this sample, the odds ratio for 1968–2014 (p &lt; 0.05) and the 2020–2024 interaction (0.185, p &lt; 0.05) were significant. The odds ratio for 2015–2019, however, loses significance with clustered standard errors and in the sample excluding irrelevant uses, so whether the advantage of the core technologies became nonsignificant in the diffusion phase or in the reconfiguration phase is left undetermined. Overall, the key results for RQ1 and RQ3 held in all re-estimations, and the temporal trend for RQ2 held in all re-estimations except the</w:t>
       </w:r>
       <w:r>
         <w:t xml:space="preserve"> </w:t>
@@ -7998,7 +8010,7 @@
         <w:t xml:space="preserve"> </w:t>
       </w:r>
       <w:r>
-        <w:t xml:space="preserve">The literature has treated convergence mainly as a phenomenon between industries or between technological fields (Curran &amp; Leker, 2011; Hacklin et al., 2010; Zhang &amp; Zhang, 2025). The finding that 45.8% of the patents related to hybrid bonding (37.2% under the narrow definition) carry symbols of both domains shows that the technological convergence stage of the stage model also appears in individual inventions at the boundary between process stages of a single industry, where knowledge from vertically separated domains is integrated within inventions. In knowledge terms, this extends the study of knowledge boundaries, which has centered on firm boundaries (Brusoni et al., 2001; Kapoor &amp; Adner, 2012), to vertically separated process domains within an industry. Whereas Kapoor (2013) showed that organizational integration persisted amid the division of labor, this study shows the technological basis of that integration at the level of invention. Such inventions represent an expansion of technological interdependence that may precede the reorganization of the industry architecture (Jacobides et al., 2006), and the hypothesis that the distribution of boundary-spanning patents may serve as a leading indicator of changes in organizational boundaries is left for future research. In addition, boundary-spanning patents included more diverse technical elements, and this association persisted in all three phases, which offers one answer to the question of which inventions embody convergence, a question that field-level indicators could hardly address. This finding is consistent with work on the economic value of patent scope (Lerner, 1994) and on portfolio strategies in fragmented markets for technology (Zhao et al., 2023; Ziedonis, 2004), but it is a compositional association partly built into the definition of the types, not evidence that diversity causes integration (Section 5.4).</w:t>
+        <w:t xml:space="preserve">The literature has treated convergence mainly as a phenomenon between industries or between technological fields (Curran &amp; Leker, 2011; Hacklin et al., 2010; Zhang &amp; Zhang, 2025). The finding that 45.8% of the applications related to hybrid bonding (37.2% under the narrow definition) carry symbols of both domains shows that the technological convergence stage of the stage model also appears in individual inventions at the boundary between process stages of a single industry, where knowledge from vertically separated domains is integrated within inventions. In knowledge terms, this extends the study of knowledge boundaries, which has centered on firm boundaries (Brusoni et al., 2001; Kapoor &amp; Adner, 2012), to vertically separated process domains within an industry. Whereas Kapoor (2013) showed that organizational integration persisted amid the division of labor, this study shows the technological basis of that integration at the level of invention. Such inventions represent an expansion of technological interdependence that may precede the reorganization of the industry architecture (Jacobides et al., 2006), and the hypothesis that the distribution of boundary-spanning patents may serve as a leading indicator of changes in organizational boundaries is left for future research. In addition, boundary-spanning patents included more diverse technical elements, and this association persisted in all three phases, which offers one answer to the question of which inventions embody convergence, a question that field-level indicators could hardly address. This finding is consistent with work on the economic value of patent scope (Lerner, 1994) and on portfolio strategies in fragmented markets for technology (Zhao et al., 2023; Ziedonis, 2004), but it is a compositional association partly built into the definition of the types, not evidence that diversity causes integration (Section 5.4).</w:t>
       </w:r>
     </w:p>
     <w:p>
@@ -8016,7 +8028,7 @@
         <w:t xml:space="preserve"> </w:t>
       </w:r>
       <w:r>
-        <w:t xml:space="preserve">Table 9 summarizes the results in chronological order. If convergence were a simple process of expansion, the share of boundary-spanning patents would be expected to increase over time; instead, process-only applications were the most common in the formation phase and integrated applications in the diffusion phase, and in the reconfiguration phase bonding-only applications increased to a level similar to that of integrated applications. The number of symbols per application followed the same pattern: bonding (H01L24) symbols increased from 3.03 up to 2014 to 4.73 in 2015–2019 and then decreased to 3.91 in 2020–2024, whereas fabrication-process (H01L21) symbols decreased from 2.12 and 2.23 to 1.46. Compared with the expectations of Section 2.3, the formation phase corresponds to the knowledge convergence stage, in which the fabrication-process knowledge required for bonding accumulates; the diffusion phase to the technological convergence stage, in which knowledge from the two domains is combined within single inventions; and the reconfiguration phase, in which the fabrication processes combined with the core technologies shifted to die support and encapsulation, to a transition toward the applicational convergence stage. The intensity and form of cross-stage knowledge integration were thus reorganized nonlinearly as the technological architecture evolved, which reveals the temporal change in the content of convergence that the stage model (Hacklin et al., 2010) proposed but that had received little empirical attention.</w:t>
+        <w:t xml:space="preserve">Table 9 summarizes the results in chronological order. If convergence were a simple process of expansion, the share of boundary-spanning patents would be expected to increase over time; instead, process-only applications were the most common in the formation phase and integrated applications in the diffusion phase, and in the reconfiguration phase bonding-only applications increased to a level similar to that of integrated applications. The number of symbols per application followed the same pattern: bonding (H01L24) symbols increased from 3.03 up to 2014 to 4.73 in 2015–2019 and then decreased to 3.91 in 2020–2024, whereas fabrication-process (H01L21) symbols, at 2.12 and 2.23 in the first two periods, decreased to 1.46. In terms of the expectations of Section 2.3, the formation phase corresponds to the knowledge convergence stage, in which the fabrication-process knowledge required for bonding accumulates; the diffusion phase to the technological convergence stage, in which knowledge from the two domains is combined within single inventions; and the reconfiguration phase, in which the fabrication processes combined with the core technologies shifted to die support and encapsulation, to a transition toward the applicational convergence stage. The intensity and form of cross-stage knowledge integration were thus reorganized nonlinearly as the technological architecture evolved, which reveals the temporal change in the content of convergence that the stage model (Hacklin et al., 2010) proposed but that had received little empirical attention.</w:t>
       </w:r>
     </w:p>
     <w:p>
@@ -8716,7 +8728,19 @@
         <w:t xml:space="preserve"> </w:t>
       </w:r>
       <w:r>
-        <w:t xml:space="preserve">The finding that the integrated-type advantage of applications containing the core technologies was pronounced in the formation phase but not observed in the reconfiguration phase is consistent with the technology cycle model, according to which, once a dominant design is established, interfaces become entrenched and subsequent innovation shifts to incremental improvement within the established design (Anderson &amp; Tushman, 1990). That inventions dealing with the core no longer incorporated fabrication-process knowledge more often than other bonding inventions, while the share of bonding applications containing the core technologies rose from 53.5% to 88.0%, is in line with Murmann and Frenken’s (2006) argument that once the design of a core element is entrenched, the need to change the elements linked to it diminishes. In light of Henderson and Clark’s (1990) argument that architectural knowledge comes to be taken for granted once a dominant design has been established, the reduced visibility of knowledge integration at the core bonding interface in individual inventions may indicate not that this integration disappeared but that it became embedded in the established design. Indeed, the core symbols remained hubs serving as stable interfaces throughout the three periods, whereas the center of the fabrication processes combined with bonding, and the links between the two, shifted from wafer fabrication to processing apparatus and packaging-stage processes (Table 6). The replacement of wafer fabrication symbols by processing apparatus symbols among the fabrication-process symbols with the highest betweenness centrality in the reconfiguration phase also echoes Rosenberg’s (1963) observation that the convergence of production processes spread through the equipment of the machine tool industry. Here, peripheral has the structural meaning of lying outside the core bonding symbols; it does not imply that these processes are less important in volume manufacturing. These results suggest that the maturation of a technological architecture does not eliminate knowledge integration across domains but relocates it from the core bonding interface to the peripheral processes that implement the architecture in new applications, and they show that the coevolutionary logic of Hacklin et al. (2009) also operates within a single technology.</w:t>
+        <w:t xml:space="preserve">The finding that the integrated-type advantage of applications containing the core technologies was pronounced in the formation phase but not observed in the reconfiguration phase is consistent with the technology cycle model, according to which, once a dominant design is established, interfaces become entrenched and subsequent innovation shifts to incremental improvement within the established design (Anderson &amp; Tushman, 1990). The finding that inventions dealing with the core no longer incorporated fabrication-process knowledge more often than other bonding inventions, while the share of bonding applications containing the core technologies rose from 53.5% to 88.0%, is in line with Murmann and Frenken’s (2006) argument that once the design of a core element is entrenched, the need to change the elements linked to it diminishes. In light of Henderson and Clark’s (1990) argument that architectural knowledge comes to be taken for granted once a dominant design has been established, the reduced visibility of knowledge integration at the core bonding interface in individual inventions may indicate not that this integration disappeared but that it became embedded in the established design. Indeed, the core symbols remained hubs serving as stable interfaces throughout the three periods, whereas the center of the fabrication processes combined with bonding, and the links between the two, shifted from wafer fabrication to processing apparatus and packaging-stage processes (Table 6). The replacement of wafer fabrication symbols by processing apparatus symbols among the fabrication-process symbols with the highest betweenness centrality in the reconfiguration phase also echoes Rosenberg’s (1963) observation that the convergence of production processes spread through machine tools as production equipment. Here,</w:t>
+      </w:r>
+      <w:r>
+        <w:t xml:space="preserve"> </w:t>
+      </w:r>
+      <w:r>
+        <w:t xml:space="preserve">“peripheral”</w:t>
+      </w:r>
+      <w:r>
+        <w:t xml:space="preserve"> </w:t>
+      </w:r>
+      <w:r>
+        <w:t xml:space="preserve">has the structural meaning of lying outside the core bonding symbols; it does not imply that these processes are less important in volume manufacturing. These results suggest that the maturation of a technological architecture does not eliminate knowledge integration across domains but relocates it from the core bonding interface to the peripheral processes that implement the architecture in new applications, and they show that the coevolutionary logic of Hacklin et al. (2009) also operates within a single technology.</w:t>
       </w:r>
     </w:p>
     <w:bookmarkEnd w:id="46"/>
@@ -8734,7 +8758,7 @@
         <w:pStyle w:val="FirstParagraph"/>
       </w:pPr>
       <w:r>
-        <w:t xml:space="preserve">The finding that a substantial share of applications contain both fabrication-process and bonding technologies implies that bonding capabilities alone are not sufficient in hybrid bonding and that knowledge of adjacent processes, spanning surface planarization, contamination control, surface chemistry, and alignment, may become increasingly important. Because the boundaries of production and of knowledge do not necessarily coincide (Brusoni et al., 2001; Kapoor &amp; Adner, 2012), firms need to maintain knowledge of adjacent process stages that they do not perform themselves. Moreover, in the reconfiguration phase, inventions containing the core principles did not carry fabrication-process symbols more often than other bonding inventions, and the fabrication processes combined with the core technologies were mostly processes for supporting dies and completing them as packages. This suggests that the focus of competition may be shifting from inventing the core principles to inventing applications that combine those principles with die-level processes. For the Korean memory industry, which seeks to introduce hybrid bonding in next-generation HBM stacking, this implies that packaging competitiveness may not depend on the bonding principle alone and that capabilities extending beyond fabrication capabilities such as planarization, surface chemistry, and alignment metrology to processes for handling and stacking thin dies may be required.</w:t>
+        <w:t xml:space="preserve">The finding that a substantial share of applications contain both fabrication-process and bonding technologies implies that bonding capabilities alone are not sufficient in hybrid bonding and that knowledge of adjacent processes, spanning surface planarization, contamination control, surface chemistry, and alignment, may become increasingly important. Because the boundaries of production and of knowledge do not necessarily coincide (Brusoni et al., 2001; Kapoor &amp; Adner, 2012), firms need to maintain knowledge of adjacent process stages that they do not perform themselves. Moreover, in the reconfiguration phase, inventions containing the core technologies did not carry fabrication-process symbols more often than other bonding inventions, and the fabrication processes combined with the core technologies were mostly processes for supporting dies and completing them as packages. This suggests that the focus of competition may be shifting from inventing the core bonding principle to inventing applications that combine this principle with die-level processes. For the Korean memory industry, which seeks to introduce hybrid bonding in next-generation HBM stacking, this implies that packaging competitiveness may not depend on the bonding principle alone and that capabilities encompassing not only fabrication capabilities such as planarization, surface chemistry, and alignment metrology but also processes for handling and stacking thin dies may be required.</w:t>
       </w:r>
     </w:p>
     <w:bookmarkEnd w:id="47"/>
@@ -8752,7 +8776,7 @@
         <w:pStyle w:val="FirstParagraph"/>
       </w:pPr>
       <w:r>
-        <w:t xml:space="preserve">This study has several limitations. First, the H01L21–H01L24 co-classification was used as an observable trace of the integration of knowledge from two process domains within an invention; it does not measure knowledge transfer between organizations, firms’ absorptive capacity, or innovation performance. Because H01L21 includes packaging-stage fabrication processes and technological scope is derived from the same CPC information as the types, the regression results held under the narrow definition, but descriptive statistics such as the integrated share depend on the definition. Given that the CPC is revised periodically and earlier applications may be reclassified retroactively, part of the observed temporal change may also reflect changes in the classification system and examination practices. Second, the title keyword search has clear criteria but cannot capture applications whose titles lack relevant terms, and because the data lack patent family identifiers, duplicates were approximated with identical titles, so the independence of observations is not fully guaranteed. Third, the regression data do not include applicants, firm types, nationalities, applications, the distinction between wafer-level and die-level bonding, or CPC symbols outside the two classes. Fourth, this study does not claim causality. Diversity and type are likely to be jointly determined, no suitable instrumental variable is available, and the period division of the core technology analysis approximates the timing of the emergence of a dominant design with filing periods rather than measuring it directly. Because patent applications are generally published 18 months after their priority date, applications from the most recent years are not yet fully observed (Figure 2), and the boundaries of the three periods were set in light of the concentration of filings rather than estimated from the data. The results for the reconfiguration phase should therefore be interpreted with this truncation in mind, and examination under alternative period divisions is left for future work. Fifth, CPC co-classification is reproducible but is assigned later than the invention itself. Text-based methods (Lei et al., 2019; Preschitschek et al., 2013; Zhu &amp; Motohashi, 2022) allow earlier detection but depend on trained models, so this study, in which the boundary between H01L21 and H01L24 is institutionally clear, prioritized reproducibility.</w:t>
+        <w:t xml:space="preserve">This study has several limitations. First, the H01L21–H01L24 co-classification was used as an observable trace of the integration of knowledge from two process domains within an invention; it does not measure knowledge transfer between organizations, firms’ absorptive capacity, or innovation performance. H01L21 includes packaging-stage fabrication processes, and technological scope is derived from the same CPC information as the types; although the regression results held under the narrow definition, descriptive statistics such as the integrated share depend on the definition. Given that the CPC is revised periodically and earlier applications may be reclassified retroactively, part of the observed temporal change may also reflect changes in the classification system and examination practices. Second, the title keyword search has clear criteria but cannot capture applications whose titles lack relevant terms, and because the data lack patent family identifiers, duplicates were approximated with identical titles, so the independence of observations is not fully guaranteed. Third, the regression data do not include applicants, firm types, nationalities, end-use areas, the distinction between wafer-level and die-level bonding, or CPC symbols outside the two classes. Fourth, this study does not claim causality. Diversity and type are likely to be jointly determined, no suitable instrumental variable is available, and the period division of the core technology analysis approximates the timing of the emergence of a dominant design with filing periods rather than measuring it directly. Because patent applications are generally published 18 months after their priority date, applications from the most recent years are not yet fully observed (Figure 2). In addition, the boundaries of the three periods were set in light of the concentration of filings rather than estimated from the data. The results for the reconfiguration phase should therefore be interpreted with this truncation in mind, and examination under alternative period divisions is left for future work. Fifth, CPC co-classification is reproducible but is assigned later than the invention itself. Text-based methods (Lei et al., 2019; Preschitschek et al., 2013; Zhu &amp; Motohashi, 2022) allow earlier detection but depend on trained models, so this study, in which the boundary between H01L21 and H01L24 is institutionally clear, prioritized reproducibility.</w:t>
       </w:r>
     </w:p>
     <w:p>
@@ -8760,7 +8784,7 @@
         <w:pStyle w:val="BodyText"/>
       </w:pPr>
       <w:r>
-        <w:t xml:space="preserve">Future research could apply the same two-class rule and discrete choice models to other process technologies in which downstream stages have begun to depend on upstream capabilities, such as advanced lithography in displays, cell-to-pack integration in batteries, and additive manufacturing in aerospace assembly, to test whether the formation–diffusion–reconfiguration pattern is general. Representations that preserve higher-order co-occurrence or generality indices (Petralia, 2020) could also be used to test directly the general-purpose character of hybrid bonding as it diffuses into logic, memory, and image sensors.</w:t>
+        <w:t xml:space="preserve">Future research could apply the same two-class rule and discrete choice models to other process technologies in which downstream stages have begun to depend on upstream capabilities, such as advanced lithography in displays, cell-to-pack integration in batteries, and additive manufacturing in aerospace assembly, to test whether the formation–diffusion–reconfiguration pattern is general. Representations that preserve higher-order co-occurrence, or generality indices (Petralia, 2020), could also be used to test directly the general-purpose character of hybrid bonding as it diffuses into logic, memory, and image sensors.</w:t>
       </w:r>
     </w:p>
     <w:bookmarkEnd w:id="48"/>
@@ -8787,7 +8811,7 @@
         <w:pStyle w:val="BodyText"/>
       </w:pPr>
       <w:r>
-        <w:t xml:space="preserve">The integrated type accounted for the largest share, 45.8% (37.2% under the narrow definition), and patents including more diverse technical elements were more likely to cross the boundary (RQ1). Knowledge integration changed through a formation phase dominated by process-only applications, a diffusion phase in which the integrated type peaked, and a reconfiguration phase in which the integrated type declined and the bonding-only type increased, and the center of gravity of filings shifted from fabrication processes toward bonding (RQ2). The odds that applications containing the core technologies also carried fabrication-process classifications were 11.1 times those of other applications in the formation phase, but the difference was not significant in the reconfiguration phase, and the center of the fabrication processes combined with bonding shifted from wafer fabrication to processing apparatus and packaging-stage processes (RQ3). As the technological architecture matured, the integration of knowledge from the two process stages did not disappear but relocated from the core bonding interface to the peripheral processes that implement the architecture.</w:t>
+        <w:t xml:space="preserve">The integrated type accounted for the largest share, 45.8%, and still accounted for 37.2% under the narrow definition, and applications including more diverse technical elements were more likely to cross the boundary (RQ1). Knowledge integration changed through a formation phase dominated by process-only applications, a diffusion phase in which the integrated type peaked, and a reconfiguration phase in which the integrated type declined and the bonding-only type increased, and the center of gravity of filings shifted from fabrication processes toward bonding (RQ2). The odds that applications containing the core technologies also carried fabrication-process classifications were 11.1 times those of other bonding applications in the formation phase, but the difference was not significant in the reconfiguration phase, and the center of the fabrication processes combined with bonding shifted from wafer fabrication to processing apparatus and packaging-stage processes (RQ3). As the technological architecture matured, the integration of knowledge from the two process stages did not disappear but relocated from the core bonding interface to the peripheral processes that implement the architecture.</w:t>
       </w:r>
     </w:p>
     <w:p>
@@ -8795,7 +8819,7 @@
         <w:pStyle w:val="BodyText"/>
       </w:pPr>
       <w:r>
-        <w:t xml:space="preserve">This study extends the scope of technology convergence research to convergence between process stages within the same industry and recasts co-classification as types of individual patents, linking patent-level heterogeneity and its temporal change to core technologies identified through technology cluster and network analyses. By tracing how knowledge from vertically separated process domains is integrated in inventions and where this integration takes place as a technology matures, it links innovation and knowledge.</w:t>
+        <w:t xml:space="preserve">This study extends the scope of technology convergence research to convergence between process stages within the same industry and recasts co-classification as types of individual patents, linking patent-level heterogeneity and its temporal change to core technologies identified through technology cluster and network analyses. By tracing how knowledge from vertically separated process domains is integrated in inventions and where this integration takes place as a technology matures, it links research on technological innovation with research on knowledge integration across knowledge boundaries.</w:t>
       </w:r>
     </w:p>
     <w:p>
@@ -12721,7 +12745,7 @@
         <w:pStyle w:val="FirstParagraph"/>
       </w:pPr>
       <w:r>
-        <w:t xml:space="preserve">Tables C.1 and C.2 present the full coefficients of the re-estimations summarized in Table 7, with the adjusted-scope specification and the 2010–2024 sample added. Each column is a multinomial logit in which one sample or variable definition is changed, and the baseline column is identical to the multinomial logit of Table 4. Filing office dummies are included as control variables in all columns, but their coefficients are omitted. Adjusted scope refers to the type-minimum-adjusted CPC scope (breadth_adj), which subtracts one symbol for each class an application carries; same-title deduplication to the sample that keeps only the earliest application among those with the same title; the narrow fabrication-process definition to the variable that excludes the packaging-stage process symbols of H01L21 from fabrication processes; irrelevant uses excluded to the sample without the 68 applications of Appendix A; and the</w:t>
+        <w:t xml:space="preserve">Tables C.1 and C.2 present the full coefficients of the re-estimations summarized in Table 7 (except the clustered-standard-error row, whose point estimates equal the baseline), with the adjusted-scope specification and the 2010–2024 sample added. Each column is a multinomial logit in which one sample or variable definition is changed, and the baseline column is identical to the multinomial logit of Table 4. Filing office dummies are included as control variables in all columns, but their coefficients are omitted. Adjusted scope refers to the type-minimum-adjusted CPC scope (breadth_adj), which subtracts one symbol for each class an application carries; same-title deduplication to the sample that keeps only the earliest application among those with the same title; the narrow fabrication-process definition to the variable that excludes the packaging-stage process symbols of H01L21 from fabrication processes; irrelevant uses excluded to the sample without the 68 applications of Appendix A; and the</w:t>
       </w:r>
       <w:r>
         <w:t xml:space="preserve"> </w:t>

</xml_diff>